<commit_message>
Tighten supervisor-facing thesis framing
</commit_message>
<xml_diff>
--- a/thesis_writeup/dissertation_final.docx
+++ b/thesis_writeup/dissertation_final.docx
@@ -236,7 +236,7 @@
         <w:jc w:val="both"/>
       </w:pPr>
       <w:r>
-        <w:t>The strict transfer experiments train on LIAR and evaluate on FakeNewsNet titles without target-domain adaptation. Under this setting, the weighted transformer baselines fall below a trivial majority-class (always-REAL) baseline on both Accuracy and Macro-F1, and a matched unweighted BERT control shows that distribution shift is the dominant cause of the failure. The thesis further evaluates intermediate target-domain fine-tuning as an adaptation strategy and includes a simplified TELLER-inspired LLM reasoning-atom pilot experiment. With 20% FakeNewsNet intermediate fine-tuning, weighted RoBERTa reaches 0.7447 Macro-F1 on the held-out target test split, while the TELLER-like pilot shows that coarse LLM-generated atoms do not remove cross-dataset bias by themselves.</w:t>
+        <w:t>The strict transfer experiments train on LIAR and evaluate on FakeNewsNet titles without target-domain adaptation. Under this setting, the weighted transformer baselines fall below a trivial majority-class (always-REAL) baseline on both Accuracy and Macro-F1, and an unweighted BERT control run with the same five-seed protocol suggests that distribution shift, rather than class weighting alone, is the dominant cause of the failure. The thesis further evaluates intermediate target-domain fine-tuning as an adaptation strategy and includes a simplified TELLER-inspired LLM reasoning-atom pilot experiment. In the current seed-42 intermediate fine-tuning pass, 20% FakeNewsNet intermediate fine-tuning gives weighted RoBERTa 0.7447 Macro-F1 on the held-out target test split; this is treated as a recovery signal to be confirmed across additional seeds. The TELLER-like pilot shows that coarse LLM-generated atoms do not remove cross-dataset bias by themselves.</w:t>
       </w:r>
     </w:p>
     <w:p>
@@ -13311,7 +13311,7 @@
         <w:jc w:val="both"/>
       </w:pPr>
       <w:r>
-        <w:t>All four LIAR-trained baselines, including the unweighted BERT control, drop substantially when moved from LIAR to FakeNewsNet titles. TF-IDF drops from 0.6005 LIAR Macro-F1 to 0.4745 on FakeNewsNet combined titles. Weighted RoBERTa, although highest on LIAR with 0.6396 Macro-F1, drops to 0.2358 on FakeNewsNet combined titles. Weighted BERT drops from 0.6322 to 0.2682. The unweighted BERT control discussed in Section 6.7 reaches 0.2806 Macro-F1 on FakeNewsNet combined titles, which is essentially the same as weighted BERT. Compared with the always-REAL majority baseline in Table 6.3, which obtains 0.4292 Macro-F1 on the combined target, only TF-IDF stays above this trivial reference on Macro-F1 (0.4745); both weighted transformer baselines and the unweighted BERT control fall below it. This is a sharper reading of the transfer failure than the LIAR-only ranking would suggest.</w:t>
+        <w:t>The transfer drop is visible across all four LIAR-trained baselines, including the unweighted BERT control. When moved from LIAR to FakeNewsNet titles, TF-IDF drops from 0.6005 LIAR Macro-F1 to 0.4745 on FakeNewsNet combined titles. Weighted RoBERTa, although highest on LIAR with 0.6396 Macro-F1, drops to 0.2358 on FakeNewsNet combined titles. Weighted BERT drops from 0.6322 to 0.2682. The unweighted BERT control discussed in Section 6.7 reaches 0.2806 Macro-F1 on FakeNewsNet combined titles, which is essentially the same as weighted BERT. Compared with the always-REAL majority baseline in Table 6.3, which obtains 0.4292 Macro-F1 on the combined target, only TF-IDF stays above this trivial reference on Macro-F1 (0.4745); both weighted transformer baselines and the unweighted BERT control fall below it. This is a sharper reading of the transfer failure than the LIAR-only ranking would suggest.</w:t>
       </w:r>
     </w:p>
     <w:p>
@@ -14788,7 +14788,7 @@
               <w:rPr>
                 <w:sz w:val="17"/>
               </w:rPr>
-              <w:t>Best current result</w:t>
+              <w:t>Best seed-42 result</w:t>
             </w:r>
           </w:p>
         </w:tc>
@@ -15172,12 +15172,12 @@
     </w:tbl>
     <w:p>
       <w:r>
-        <w:t>The intermediate fine-tuning results change the interpretation of the cross-dataset experiment. With no target-domain adaptation, the LIAR-trained weighted RoBERTa model is almost entirely FAKE-biased on the held-out FakeNewsNet test split, with FAKE recall 0.9930 but REAL recall only 0.0183. The 5% target-domain setting does not solve the problem; it flips the bias in the opposite direction and predicts nearly all target examples as REAL, producing high Accuracy but a weak Macro-F1 of 0.4292. The 10% and 20% settings are more meaningful. With 10% target data, Macro-F1 rises to 0.7141, and with 20% target data it reaches 0.7447 while preserving both high REAL recall and improved FAKE recall.</w:t>
-      </w:r>
-    </w:p>
-    <w:p>
-      <w:r>
-        <w:t>These results show that the poor direct transfer scores are not simply caused by the target dataset being impossible. Rather, the model needs enough labelled target-domain examples to recalibrate its decision boundary. Intermediate fine-tuning is therefore the main practical response to the strict transfer failure: it turns the cross-dataset result from a negative robustness finding into evidence about how much target supervision is needed before useful transfer appears.</w:t>
+        <w:t>The current seed-42 intermediate fine-tuning pass changes the interpretation of the cross-dataset experiment. With no target-domain adaptation, the LIAR-trained weighted RoBERTa model is almost entirely FAKE-biased on the held-out FakeNewsNet test split, with FAKE recall 0.9930 but REAL recall only 0.0183. The 5% target-domain setting does not solve the problem; it flips the bias in the opposite direction and predicts nearly all target examples as REAL, producing high Accuracy but a weak Macro-F1 of 0.4292. The 10% and 20% settings are more meaningful in this run. With 10% target data, Macro-F1 rises to 0.7141, and with 20% target data it reaches 0.7447 while preserving both high REAL recall and improved FAKE recall.</w:t>
+      </w:r>
+    </w:p>
+    <w:p>
+      <w:r>
+        <w:t>These results show that the poor direct transfer scores are not simply caused by the target dataset being impossible. Rather, they indicate that enough labelled target-domain examples can recalibrate the model's decision boundary. Intermediate fine-tuning is therefore best framed as a practical recovery experiment for strict transfer failure. It turns the cross-dataset result from a negative robustness finding into an evidence question about how much target supervision is needed before useful transfer appears, but the 10% and 20% settings should be repeated across more seeds before treating the target fractions as final.</w:t>
       </w:r>
     </w:p>
     <w:p>
@@ -15298,7 +15298,7 @@
         <w:jc w:val="both"/>
       </w:pPr>
       <w:r>
-        <w:t>Strong in-domain performance does not transfer automatically, and the failure cannot be explained by class weighting alone. When LIAR-trained models are evaluated on FakeNewsNet minimal titles without adaptation, all completed baselines drop sharply. Both weighted BERT and weighted RoBERTa become strongly biased toward predicting FAKE, producing very high FAKE recall but very poor REAL recall; on the combined target, both fall below the trivial always-REAL majority-class baseline on both Accuracy and Macro-F1. A matched unweighted BERT control, trained with the same five-seed protocol but without class weights, shows nearly the same FAKE-heavy behaviour. Removing the class weights changes the magnitude of the bias only slightly, pointing to distribution shift between LIAR statements and FakeNewsNet titles as the dominant cause.</w:t>
+        <w:t>Strong in-domain performance does not transfer automatically, and the failure cannot be explained by class weighting alone. When LIAR-trained models are evaluated on FakeNewsNet minimal titles without adaptation, all completed baselines drop sharply. Both weighted BERT and weighted RoBERTa become strongly biased toward predicting FAKE, producing very high FAKE recall but very poor REAL recall; on the combined target, both fall below the trivial always-REAL majority-class baseline on both Accuracy and Macro-F1. An unweighted BERT control, trained with the same five-seed protocol but without class weights, shows nearly the same FAKE-heavy behaviour. Removing the class weights changes the magnitude of the bias only slightly, pointing to distribution shift between LIAR statements and FakeNewsNet titles as the dominant cause.</w:t>
       </w:r>
     </w:p>
     <w:p>
@@ -15495,7 +15495,7 @@
         <w:jc w:val="both"/>
       </w:pPr>
       <w:r>
-        <w:t>This dissertation set out to evaluate reproducible fake news detection baselines on the LIAR dataset, to measure how well those baselines transfer to FakeNewsNet titles, and to test whether intermediate target-domain fine-tuning can recover performance after strict transfer failure. Starting from a deterministic TF-IDF + Logistic Regression reference, the study added BERT, class-weighted BERT, RoBERTa, and class-weighted RoBERTa under consistent binary label mapping, fixed data splits, and a five-seed evaluation protocol. A matched unweighted BERT control was run to isolate the role of class weighting, and a later intermediate fine-tuning experiment tested 5%, 10%, and 20% FakeNewsNet target-domain supervision.</w:t>
+        <w:t>This dissertation set out to evaluate reproducible fake news detection baselines on the LIAR dataset, to measure how well those baselines transfer to FakeNewsNet titles, and to test whether intermediate target-domain fine-tuning can recover performance after strict transfer failure. Starting from a deterministic TF-IDF + Logistic Regression reference, the study added BERT, class-weighted BERT, RoBERTa, and class-weighted RoBERTa under consistent binary label mapping, fixed data splits, and a five-seed evaluation protocol. An unweighted BERT control was run to isolate the role of class weighting, and a later seed-42 intermediate fine-tuning experiment tested 5%, 10%, and 20% FakeNewsNet target-domain supervision.</w:t>
       </w:r>
     </w:p>
     <w:p>

</xml_diff>